<commit_message>
Add new CV documents and update existing ones; modify contact and home page to use profile copy and Riverpod for state management
</commit_message>
<xml_diff>
--- a/cv/Europass_Flutter_Mobile_Iheb_Meftah.docx
+++ b/cv/Europass_Flutter_Mobile_Iheb_Meftah.docx
@@ -106,11 +106,14 @@
           <w:t>ihebmeftah666@gmail.com</w:t>
         </w:r>
       </w:hyperlink>
-    </w:p>
-    <w:p>
-      <w:pPr>
-        <w:spacing w:before="0" w:after="0" w:line="240" w:lineRule="auto"/>
-      </w:pPr>
+      <w:r>
+        <w:rPr>
+          <w:rFonts w:ascii="Calibri" w:hAnsi="Calibri" w:eastAsia="Calibri"/>
+          <w:b w:val="0"/>
+          <w:sz w:val="22"/>
+        </w:rPr>
+        <w:t xml:space="preserve">    </w:t>
+      </w:r>
       <w:r>
         <w:rPr>
           <w:rFonts w:ascii="Calibri" w:hAnsi="Calibri" w:eastAsia="Calibri"/>
@@ -130,28 +133,7 @@
     </w:p>
     <w:p>
       <w:pPr>
-        <w:spacing w:before="0" w:after="0" w:line="240" w:lineRule="auto"/>
-      </w:pPr>
-      <w:r>
-        <w:rPr>
-          <w:rFonts w:ascii="Calibri" w:hAnsi="Calibri" w:eastAsia="Calibri"/>
-          <w:b/>
-          <w:sz w:val="22"/>
-        </w:rPr>
-        <w:t xml:space="preserve">Address: </w:t>
-      </w:r>
-      <w:r>
-        <w:rPr>
-          <w:rFonts w:ascii="Calibri" w:hAnsi="Calibri" w:eastAsia="Calibri"/>
-          <w:b w:val="0"/>
-          <w:sz w:val="22"/>
-        </w:rPr>
-        <w:t>Kirchhain, Germany</w:t>
-      </w:r>
-    </w:p>
-    <w:p>
-      <w:pPr>
-        <w:spacing w:before="0" w:after="0" w:line="240" w:lineRule="auto"/>
+        <w:spacing w:before="0" w:after="40" w:line="240" w:lineRule="auto"/>
       </w:pPr>
       <w:r>
         <w:rPr>
@@ -172,11 +154,14 @@
           <w:t>linkedin.com/in/ihebmeftah666</w:t>
         </w:r>
       </w:hyperlink>
-    </w:p>
-    <w:p>
-      <w:pPr>
-        <w:spacing w:before="0" w:after="0" w:line="240" w:lineRule="auto"/>
-      </w:pPr>
+      <w:r>
+        <w:rPr>
+          <w:rFonts w:ascii="Calibri" w:hAnsi="Calibri" w:eastAsia="Calibri"/>
+          <w:b w:val="0"/>
+          <w:sz w:val="22"/>
+        </w:rPr>
+        <w:t xml:space="preserve">    </w:t>
+      </w:r>
       <w:r>
         <w:rPr>
           <w:rFonts w:ascii="Calibri" w:hAnsi="Calibri" w:eastAsia="Calibri"/>
@@ -196,11 +181,14 @@
           <w:t>github.com/ihebmeftah</w:t>
         </w:r>
       </w:hyperlink>
-    </w:p>
-    <w:p>
-      <w:pPr>
-        <w:spacing w:before="0" w:after="0" w:line="240" w:lineRule="auto"/>
-      </w:pPr>
+      <w:r>
+        <w:rPr>
+          <w:rFonts w:ascii="Calibri" w:hAnsi="Calibri" w:eastAsia="Calibri"/>
+          <w:b w:val="0"/>
+          <w:sz w:val="22"/>
+        </w:rPr>
+        <w:t xml:space="preserve">    </w:t>
+      </w:r>
       <w:r>
         <w:rPr>
           <w:rFonts w:ascii="Calibri" w:hAnsi="Calibri" w:eastAsia="Calibri"/>
@@ -242,7 +230,7 @@
           <w:b w:val="0"/>
           <w:sz w:val="22"/>
         </w:rPr>
-        <w:t>Flutter mobile engineer and team lead in Kirchhain, Germany. Since June 2022 at EdTrust, led four Flutter applications for teachers, students, parents, and school administrators. Contract work covers inventory with offline sync and barcode scanning, an education app with the British Council, and roadside assistance with maps and live location. Stack: Dart, Firebase, REST APIs, CI/CD, GetX, BLoC, and Serverpod.</w:t>
+        <w:t>Mobile developer in Germany, looking for a new position and a new way to contribute. I ship Flutter applications for iOS and Android, from the first feature through release, and I also work with Java and system design. At EdTrust I led EdTeacher, EdManager, EdStudent, and EdParent.</w:t>
       </w:r>
     </w:p>
     <w:p>
@@ -266,7 +254,7 @@
           <w:b/>
           <w:sz w:val="24"/>
         </w:rPr>
-        <w:t>Mobile Team Lead</w:t>
+        <w:t>Flutter Lead (Full-time)</w:t>
       </w:r>
       <w:r>
         <w:rPr>
@@ -282,7 +270,7 @@
           <w:b w:val="0"/>
           <w:sz w:val="22"/>
         </w:rPr>
-        <w:t>June 2022 – Present</w:t>
+        <w:t>July 2024 – Present</w:t>
       </w:r>
     </w:p>
     <w:p>
@@ -309,7 +297,119 @@
           <w:b w:val="0"/>
           <w:sz w:val="22"/>
         </w:rPr>
-        <w:t>Leads the mobile team and the delivery of four Flutter applications used by teachers, students, parents, and school administrators. The work covers a scalable architecture, Firebase, CI/CD pipelines, and API integrations, from feature development through release on iOS and Android.</w:t>
+        <w:t>Full-time Flutter lead, working hybrid. Led development and deployment of EdTeacher, EdManager, EdStudent, and EdParent. These apps are used by thousands of teachers, students, administrators, and parents for school communication and monitoring. The work covers system design, a scalable architecture, Flutter, GetX, Firebase, CI/CD, and API integrations, through release on iOS and Android.</w:t>
+      </w:r>
+    </w:p>
+    <w:p>
+      <w:pPr>
+        <w:spacing w:before="160" w:after="0" w:line="252" w:lineRule="auto"/>
+      </w:pPr>
+      <w:r>
+        <w:rPr>
+          <w:rFonts w:ascii="Calibri" w:hAnsi="Calibri" w:eastAsia="Calibri"/>
+          <w:b/>
+          <w:sz w:val="24"/>
+        </w:rPr>
+        <w:t>Flutter Developer (Part-time)</w:t>
+      </w:r>
+      <w:r>
+        <w:rPr>
+          <w:rFonts w:ascii="Calibri" w:hAnsi="Calibri" w:eastAsia="Calibri"/>
+          <w:b w:val="0"/>
+          <w:sz w:val="24"/>
+        </w:rPr>
+        <w:t xml:space="preserve">  |  </w:t>
+      </w:r>
+      <w:r>
+        <w:rPr>
+          <w:rFonts w:ascii="Calibri" w:hAnsi="Calibri" w:eastAsia="Calibri"/>
+          <w:b w:val="0"/>
+          <w:sz w:val="22"/>
+        </w:rPr>
+        <w:t>September 2022 – July 2024</w:t>
+      </w:r>
+    </w:p>
+    <w:p>
+      <w:pPr>
+        <w:spacing w:before="0" w:after="20" w:line="252" w:lineRule="auto"/>
+      </w:pPr>
+      <w:r>
+        <w:rPr>
+          <w:rFonts w:ascii="Calibri" w:hAnsi="Calibri" w:eastAsia="Calibri"/>
+          <w:b w:val="0"/>
+          <w:color w:val="3F3F3F"/>
+          <w:sz w:val="22"/>
+        </w:rPr>
+        <w:t>EdTrust, Tunis</w:t>
+      </w:r>
+    </w:p>
+    <w:p>
+      <w:pPr>
+        <w:spacing w:before="20" w:after="40" w:line="252" w:lineRule="auto"/>
+      </w:pPr>
+      <w:r>
+        <w:rPr>
+          <w:rFonts w:ascii="Calibri" w:hAnsi="Calibri" w:eastAsia="Calibri"/>
+          <w:b w:val="0"/>
+          <w:sz w:val="22"/>
+        </w:rPr>
+        <w:t>Part-time Flutter developer, working remotely, on the EdTrust applications. Built features, connected APIs, and supported releases on iOS and Android.</w:t>
+      </w:r>
+    </w:p>
+    <w:p>
+      <w:pPr>
+        <w:spacing w:before="160" w:after="0" w:line="252" w:lineRule="auto"/>
+      </w:pPr>
+      <w:r>
+        <w:rPr>
+          <w:rFonts w:ascii="Calibri" w:hAnsi="Calibri" w:eastAsia="Calibri"/>
+          <w:b/>
+          <w:sz w:val="24"/>
+        </w:rPr>
+        <w:t>Flutter Intern</w:t>
+      </w:r>
+      <w:r>
+        <w:rPr>
+          <w:rFonts w:ascii="Calibri" w:hAnsi="Calibri" w:eastAsia="Calibri"/>
+          <w:b w:val="0"/>
+          <w:sz w:val="24"/>
+        </w:rPr>
+        <w:t xml:space="preserve">  |  </w:t>
+      </w:r>
+      <w:r>
+        <w:rPr>
+          <w:rFonts w:ascii="Calibri" w:hAnsi="Calibri" w:eastAsia="Calibri"/>
+          <w:b w:val="0"/>
+          <w:sz w:val="22"/>
+        </w:rPr>
+        <w:t>June 2022 – August 2022</w:t>
+      </w:r>
+    </w:p>
+    <w:p>
+      <w:pPr>
+        <w:spacing w:before="0" w:after="20" w:line="252" w:lineRule="auto"/>
+      </w:pPr>
+      <w:r>
+        <w:rPr>
+          <w:rFonts w:ascii="Calibri" w:hAnsi="Calibri" w:eastAsia="Calibri"/>
+          <w:b w:val="0"/>
+          <w:color w:val="3F3F3F"/>
+          <w:sz w:val="22"/>
+        </w:rPr>
+        <w:t>EdTrust, Tunis</w:t>
+      </w:r>
+    </w:p>
+    <w:p>
+      <w:pPr>
+        <w:spacing w:before="20" w:after="40" w:line="252" w:lineRule="auto"/>
+      </w:pPr>
+      <w:r>
+        <w:rPr>
+          <w:rFonts w:ascii="Calibri" w:hAnsi="Calibri" w:eastAsia="Calibri"/>
+          <w:b w:val="0"/>
+          <w:sz w:val="22"/>
+        </w:rPr>
+        <w:t>Flutter developer intern on the mobile team. Contributed to Flutter applications for teachers, students, parents, and school administrators.</w:t>
       </w:r>
     </w:p>
     <w:p>
@@ -547,34 +647,28 @@
     </w:p>
     <w:p>
       <w:pPr>
-        <w:spacing w:before="120" w:after="0" w:line="252" w:lineRule="auto"/>
+        <w:spacing w:before="120" w:after="40" w:line="252" w:lineRule="auto"/>
       </w:pPr>
-      <w:r>
-        <w:rPr>
-          <w:rFonts w:ascii="Calibri" w:hAnsi="Calibri" w:eastAsia="Calibri"/>
-          <w:b/>
-          <w:sz w:val="24"/>
-        </w:rPr>
-        <w:t>Sip &amp; Sync POS</w:t>
-      </w:r>
-    </w:p>
-    <w:p>
-      <w:pPr>
-        <w:spacing w:before="0" w:after="0" w:line="252" w:lineRule="auto"/>
-      </w:pPr>
+      <w:hyperlink r:id="rId14">
+        <w:r>
+          <w:rPr>
+            <w:color w:val="0B3A82"/>
+            <w:u w:val="single"/>
+            <w:sz w:val="24"/>
+            <w:rFonts w:ascii="Calibri" w:hAnsi="Calibri"/>
+            <w:b/>
+          </w:rPr>
+          <w:t>Sip &amp; Sync POS</w:t>
+        </w:r>
+      </w:hyperlink>
       <w:r>
         <w:rPr>
           <w:rFonts w:ascii="Calibri" w:hAnsi="Calibri" w:eastAsia="Calibri"/>
           <w:b w:val="0"/>
           <w:sz w:val="22"/>
         </w:rPr>
-        <w:t>Flutter, Dart, and Serverpod. Café system for several locations, with real-time orders and inventory. Built for the Serverpod Flutter Hackathon (Devpost).</w:t>
+        <w:t xml:space="preserve"> — </w:t>
       </w:r>
-    </w:p>
-    <w:p>
-      <w:pPr>
-        <w:spacing w:before="0" w:after="20" w:line="252" w:lineRule="auto"/>
-      </w:pPr>
       <w:hyperlink r:id="rId14">
         <w:r>
           <w:rPr>
@@ -583,40 +677,34 @@
             <w:sz w:val="22"/>
             <w:rFonts w:ascii="Calibri" w:hAnsi="Calibri"/>
           </w:rPr>
-          <w:t>github.com/ihebmeftah/sip_sync</w:t>
+          <w:t>Flutter, Dart, and Serverpod. Café system for several locations, with real-time orders and inventory. Built for the Serverpod Flutter Hackathon (Devpost).</w:t>
         </w:r>
       </w:hyperlink>
     </w:p>
     <w:p>
       <w:pPr>
-        <w:spacing w:before="120" w:after="0" w:line="252" w:lineRule="auto"/>
+        <w:spacing w:before="120" w:after="40" w:line="252" w:lineRule="auto"/>
       </w:pPr>
-      <w:r>
-        <w:rPr>
-          <w:rFonts w:ascii="Calibri" w:hAnsi="Calibri" w:eastAsia="Calibri"/>
-          <w:b/>
-          <w:sz w:val="24"/>
-        </w:rPr>
-        <w:t>E-commerce application</w:t>
-      </w:r>
-    </w:p>
-    <w:p>
-      <w:pPr>
-        <w:spacing w:before="0" w:after="0" w:line="252" w:lineRule="auto"/>
-      </w:pPr>
+      <w:hyperlink r:id="rId15">
+        <w:r>
+          <w:rPr>
+            <w:color w:val="0B3A82"/>
+            <w:u w:val="single"/>
+            <w:sz w:val="24"/>
+            <w:rFonts w:ascii="Calibri" w:hAnsi="Calibri"/>
+            <w:b/>
+          </w:rPr>
+          <w:t>E-commerce application</w:t>
+        </w:r>
+      </w:hyperlink>
       <w:r>
         <w:rPr>
           <w:rFonts w:ascii="Calibri" w:hAnsi="Calibri" w:eastAsia="Calibri"/>
           <w:b w:val="0"/>
           <w:sz w:val="22"/>
         </w:rPr>
-        <w:t>Flutter, GetX, Firebase, and MVC, covering storefront flows on mobile and web.</w:t>
+        <w:t xml:space="preserve"> — </w:t>
       </w:r>
-    </w:p>
-    <w:p>
-      <w:pPr>
-        <w:spacing w:before="0" w:after="20" w:line="252" w:lineRule="auto"/>
-      </w:pPr>
       <w:hyperlink r:id="rId15">
         <w:r>
           <w:rPr>
@@ -625,40 +713,34 @@
             <w:sz w:val="22"/>
             <w:rFonts w:ascii="Calibri" w:hAnsi="Calibri"/>
           </w:rPr>
-          <w:t>github.com/ihebmeftah/E-commerce-Full-App-Web-Getx---Firebase-Mvc</w:t>
+          <w:t>Flutter, GetX, Firebase, and MVC, covering storefront flows on mobile and web.</w:t>
         </w:r>
       </w:hyperlink>
     </w:p>
     <w:p>
       <w:pPr>
-        <w:spacing w:before="120" w:after="0" w:line="252" w:lineRule="auto"/>
+        <w:spacing w:before="120" w:after="40" w:line="252" w:lineRule="auto"/>
       </w:pPr>
-      <w:r>
-        <w:rPr>
-          <w:rFonts w:ascii="Calibri" w:hAnsi="Calibri" w:eastAsia="Calibri"/>
-          <w:b/>
-          <w:sz w:val="24"/>
-        </w:rPr>
-        <w:t>Movies applications</w:t>
-      </w:r>
-    </w:p>
-    <w:p>
-      <w:pPr>
-        <w:spacing w:before="0" w:after="0" w:line="252" w:lineRule="auto"/>
-      </w:pPr>
+      <w:hyperlink r:id="rId16">
+        <w:r>
+          <w:rPr>
+            <w:color w:val="0B3A82"/>
+            <w:u w:val="single"/>
+            <w:sz w:val="24"/>
+            <w:rFonts w:ascii="Calibri" w:hAnsi="Calibri"/>
+            <w:b/>
+          </w:rPr>
+          <w:t>Movies applications</w:t>
+        </w:r>
+      </w:hyperlink>
       <w:r>
         <w:rPr>
           <w:rFonts w:ascii="Calibri" w:hAnsi="Calibri" w:eastAsia="Calibri"/>
           <w:b w:val="0"/>
           <w:sz w:val="22"/>
         </w:rPr>
-        <w:t>One client in Ionic and TypeScript, and a native SwiftUI client.</w:t>
+        <w:t xml:space="preserve"> — </w:t>
       </w:r>
-    </w:p>
-    <w:p>
-      <w:pPr>
-        <w:spacing w:before="0" w:after="20" w:line="252" w:lineRule="auto"/>
-      </w:pPr>
       <w:hyperlink r:id="rId16">
         <w:r>
           <w:rPr>
@@ -667,7 +749,7 @@
             <w:sz w:val="22"/>
             <w:rFonts w:ascii="Calibri" w:hAnsi="Calibri"/>
           </w:rPr>
-          <w:t>github.com/ihebmeftah/movies_ionic_project</w:t>
+          <w:t>One client in Ionic and TypeScript, and a native SwiftUI client.</w:t>
         </w:r>
       </w:hyperlink>
     </w:p>
@@ -784,7 +866,7 @@
           <w:b w:val="0"/>
           <w:sz w:val="22"/>
         </w:rPr>
-        <w:t>TypeScript, NestJS, Express, Angular, Ionic, PostgreSQL, MongoDB</w:t>
+        <w:t>Java, system design, software architecture, TypeScript, NestJS, Express, Angular, Ionic, PostgreSQL, MongoDB</w:t>
       </w:r>
     </w:p>
     <w:p>

</xml_diff>